<commit_message>
:fire: old stuff ➕ resume
</commit_message>
<xml_diff>
--- a/Tim_Hunold_Sept_2026.docx
+++ b/Tim_Hunold_Sept_2026.docx
@@ -387,6 +387,9 @@
       <w:r>
         <w:t>PROFESSIONAL EXPERIENCE</w:t>
       </w:r>
+      <w:r>
+        <w:t xml:space="preserve"> (more not included)</w:t>
+      </w:r>
     </w:p>
     <w:p>
       <w:pPr>
@@ -1349,12 +1352,143 @@
       </w:r>
     </w:p>
     <w:p>
+      <w:pPr>
+        <w:pStyle w:val="Heading2"/>
+      </w:pPr>
       <w:r>
         <w:pict w14:anchorId="6F529AA5">
           <v:rect id="_x0000_i1034" style="width:0;height:1.5pt" o:hralign="center" o:hrstd="t" o:hr="t"/>
         </w:pict>
       </w:r>
-    </w:p>
+      <w:r>
+        <w:t>Primitive Logic</w:t>
+      </w:r>
+      <w:r>
+        <w:t xml:space="preserve"> — Lead Front End UI </w:t>
+      </w:r>
+      <w:r>
+        <w:t>Engineer</w:t>
+      </w:r>
+    </w:p>
+    <w:p>
+      <w:pPr>
+        <w:pStyle w:val="Heading3"/>
+      </w:pPr>
+      <w:r>
+        <w:t>Sep</w:t>
+      </w:r>
+      <w:r>
+        <w:t xml:space="preserve"> 201</w:t>
+      </w:r>
+      <w:r>
+        <w:t>4</w:t>
+      </w:r>
+      <w:r>
+        <w:t xml:space="preserve"> – </w:t>
+      </w:r>
+      <w:r>
+        <w:t>Apr</w:t>
+      </w:r>
+      <w:r>
+        <w:t xml:space="preserve"> 201</w:t>
+      </w:r>
+      <w:r>
+        <w:t>5</w:t>
+      </w:r>
+    </w:p>
+    <w:p>
+      <w:pPr>
+        <w:pStyle w:val="Compact"/>
+        <w:numPr>
+          <w:ilvl w:val="0"/>
+          <w:numId w:val="12"/>
+        </w:numPr>
+      </w:pPr>
+      <w:r>
+        <w:t>Lead revamp and compliance initiatives for major public utilities</w:t>
+      </w:r>
+      <w:r>
+        <w:t>.</w:t>
+      </w:r>
+    </w:p>
+    <w:p>
+      <w:pPr>
+        <w:pStyle w:val="Compact"/>
+        <w:numPr>
+          <w:ilvl w:val="0"/>
+          <w:numId w:val="12"/>
+        </w:numPr>
+      </w:pPr>
+      <w:r>
+        <w:t>Reduce friction for large ecommerce marketplace selling pilot program smart devices to manage thermostats, water usage/leaks</w:t>
+      </w:r>
+      <w:r>
+        <w:t>.</w:t>
+      </w:r>
+    </w:p>
+    <w:p>
+      <w:pPr>
+        <w:pStyle w:val="Compact"/>
+        <w:numPr>
+          <w:ilvl w:val="0"/>
+          <w:numId w:val="12"/>
+        </w:numPr>
+      </w:pPr>
+      <w:r>
+        <w:t>Manage teams and attend meeting in Los Angeles, San Diego and Las Vegas concurrently</w:t>
+      </w:r>
+      <w:r>
+        <w:t>.</w:t>
+      </w:r>
+    </w:p>
+    <w:p>
+      <w:pPr>
+        <w:pStyle w:val="Compact"/>
+        <w:numPr>
+          <w:ilvl w:val="0"/>
+          <w:numId w:val="12"/>
+        </w:numPr>
+      </w:pPr>
+      <w:r>
+        <w:t>Added WCAG, Bootstrap and AngularJS (1.2) to Oracle ADF framework/CMS</w:t>
+      </w:r>
+      <w:r>
+        <w:t>.</w:t>
+      </w:r>
+    </w:p>
+    <w:p>
+      <w:pPr>
+        <w:pStyle w:val="Heading3"/>
+      </w:pPr>
+      <w:r>
+        <w:t>Technologies</w:t>
+      </w:r>
+    </w:p>
+    <w:p>
+      <w:pPr>
+        <w:pStyle w:val="FirstParagraph"/>
+      </w:pPr>
+      <w:r>
+        <w:t>AngularJS 1.</w:t>
+      </w:r>
+      <w:r>
+        <w:t xml:space="preserve">2, </w:t>
+      </w:r>
+      <w:r>
+        <w:t>Node.js, GulpJS, JSON, WCAG, Handlebars</w:t>
+      </w:r>
+      <w:r>
+        <w:t>, Bootstrap</w:t>
+      </w:r>
+    </w:p>
+    <w:p>
+      <w:r>
+        <w:pict w14:anchorId="1BAD681D">
+          <v:rect id="_x0000_i1069" style="width:0;height:1.5pt" o:hralign="center" o:hrstd="t" o:hr="t"/>
+        </w:pict>
+      </w:r>
+    </w:p>
+    <w:p/>
     <w:p>
       <w:pPr>
         <w:pStyle w:val="Heading2"/>

</xml_diff>